<commit_message>
docs: update product brief from latest planning doc
</commit_message>
<xml_diff>
--- a/PalatePass.docx
+++ b/PalatePass.docx
@@ -1887,8 +1887,10 @@
           <w:sz w:val="24"/>
           <w:szCs w:val="24"/>
         </w:rPr>
-        <w:t>React (or Next.js)</w:t>
-      </w:r>
+        <w:t>Next.js</w:t>
+      </w:r>
+      <w:bookmarkStart w:id="0" w:name="_GoBack"/>
+      <w:bookmarkEnd w:id="0"/>
     </w:p>
     <w:p>
       <w:pPr>
@@ -1989,7 +1991,7 @@
           <w:sz w:val="24"/>
           <w:szCs w:val="24"/>
         </w:rPr>
-        <w:t>PostgreSQL/ MongoDB</w:t>
+        <w:t>PostgreSQL</w:t>
       </w:r>
     </w:p>
     <w:p>
@@ -2282,19 +2284,7 @@
         <w:t>Advanced analytics on taste profile</w:t>
       </w:r>
       <w:r>
-        <w:t xml:space="preserve"> (taste personality, t</w:t>
-      </w:r>
-      <w:r>
-        <w:t>rends over time</w:t>
-      </w:r>
-      <w:r>
-        <w:t>, r</w:t>
-      </w:r>
-      <w:r>
-        <w:t>estaurants you’re most likely to enjoy next</w:t>
-      </w:r>
-      <w:r>
-        <w:t>)</w:t>
+        <w:t xml:space="preserve"> (taste personality, trends over time, restaurants you’re most likely to enjoy next)</w:t>
       </w:r>
     </w:p>
     <w:p>
@@ -2851,8 +2841,6 @@
         </w:rPr>
         <w:t>Influencer restaurant lists</w:t>
       </w:r>
-      <w:bookmarkStart w:id="0" w:name="_GoBack"/>
-      <w:bookmarkEnd w:id="0"/>
     </w:p>
     <w:p>
       <w:pPr>

</xml_diff>